<commit_message>
Hoermann-Kanaele: nur Existenz + Sensor-Herkunft, Aktion (HA-variabel) raus
In der Steuerungs-Doku (CLAUDE.md §5, Kurzbeschreibung, Uebersicht, Verdrahtung §11a)
die konkrete HA-Aktion (oeffnen/Hoflicht) entfernt - DI7/DI8 sind reine Melder,
was sie ausloesen ist in HA frei belegbar. Uebergabe-Doku + ToDo (HA-Plan) behalten.
Word-Doku neu generiert.

Co-Authored-By: Claude Opus 4.8 <noreply@anthropic.com>
</commit_message>
<xml_diff>
--- a/Hoftor_Dokumentation_v0.39.docx
+++ b/Hoftor_Dokumentation_v0.39.docx
@@ -1620,10 +1620,7 @@
         <w:t xml:space="preserve"> </w:t>
       </w:r>
       <w:r>
-        <w:t xml:space="preserve">— die Schalt-Logik liegt in HA:</w:t>
-      </w:r>
-      <w:r>
-        <w:t xml:space="preserve"> </w:t>
+        <w:t xml:space="preserve">— der ESP meldet nur (</w:t>
       </w:r>
       <w:r>
         <w:rPr>
@@ -1635,7 +1632,7 @@
         <w:t xml:space="preserve"> </w:t>
       </w:r>
       <w:r>
-        <w:t xml:space="preserve">→ Hoftor öffnen,</w:t>
+        <w:t xml:space="preserve">/</w:t>
       </w:r>
       <w:r>
         <w:t xml:space="preserve"> </w:t>
@@ -1647,10 +1644,23 @@
         <w:t xml:space="preserve">_k2</w:t>
       </w:r>
       <w:r>
-        <w:t xml:space="preserve"> </w:t>
-      </w:r>
-      <w:r>
-        <w:t xml:space="preserve">→ Hoflicht (Shelly). So ohne Re-Flash umlegbar.</w:t>
+        <w:t xml:space="preserve">);</w:t>
+      </w:r>
+      <w:r>
+        <w:t xml:space="preserve"> </w:t>
+      </w:r>
+      <w:r>
+        <w:rPr>
+          <w:b/>
+          <w:bCs/>
+        </w:rPr>
+        <w:t xml:space="preserve">was die Kanäle auslösen, wird frei in HA festgelegt</w:t>
+      </w:r>
+      <w:r>
+        <w:t xml:space="preserve"> </w:t>
+      </w:r>
+      <w:r>
+        <w:t xml:space="preserve">und ist ohne Re-Flash änderbar.</w:t>
       </w:r>
     </w:p>
     <w:bookmarkEnd w:id="15"/>
@@ -2215,11 +2225,33 @@
         </w:numPr>
       </w:pPr>
       <w:r>
-        <w:rPr>
-          <w:b/>
-          <w:bCs/>
-        </w:rPr>
-        <w:t xml:space="preserve">Taste K1 → Hoftor öffnen.</w:t>
+        <w:t xml:space="preserve">Jede Handsender-Taste meldet sich als Eingang am ESP:</w:t>
+      </w:r>
+      <w:r>
+        <w:t xml:space="preserve"> </w:t>
+      </w:r>
+      <w:r>
+        <w:rPr>
+          <w:b/>
+          <w:bCs/>
+        </w:rPr>
+        <w:t xml:space="preserve">K1 → DI7</w:t>
+      </w:r>
+      <w:r>
+        <w:t xml:space="preserve">,</w:t>
+      </w:r>
+      <w:r>
+        <w:t xml:space="preserve"> </w:t>
+      </w:r>
+      <w:r>
+        <w:rPr>
+          <w:b/>
+          <w:bCs/>
+        </w:rPr>
+        <w:t xml:space="preserve">K2 → DI8</w:t>
+      </w:r>
+      <w:r>
+        <w:t xml:space="preserve">.</w:t>
       </w:r>
     </w:p>
     <w:p>
@@ -2235,13 +2267,13 @@
           <w:b/>
           <w:bCs/>
         </w:rPr>
-        <w:t xml:space="preserve">Taste K2 → Hoflicht</w:t>
-      </w:r>
-      <w:r>
-        <w:t xml:space="preserve"> </w:t>
-      </w:r>
-      <w:r>
-        <w:t xml:space="preserve">(geplant).</w:t>
+        <w:t xml:space="preserve">Was die Tasten auslösen, wird in Home Assistant festgelegt</w:t>
+      </w:r>
+      <w:r>
+        <w:t xml:space="preserve"> </w:t>
+      </w:r>
+      <w:r>
+        <w:t xml:space="preserve">(frei änderbar, ohne den ESP neu zu flashen).</w:t>
       </w:r>
       <w:r>
         <w:t xml:space="preserve"> </w:t>

</xml_diff>

<commit_message>
Hoftor gehoert zur Keller-HA: kein Server-Sync mehr, nur Repo
DG-Share (192.168.210.11/config/esphome) ist NICHT mehr das Ziel - Hoftor wurde
auf die Keller-HA uebernommen. YAML/css/js leben nur noch im Repo, Florian flasht
manuell/von Keller. Verwaiste DG-Kopie hat Florian geloescht.
Verweise korrigiert: CLAUDE.md Status, Uebergabe-Doku, Uebersicht (Falle 6).

Co-Authored-By: Claude Opus 4.8 <noreply@anthropic.com>
</commit_message>
<xml_diff>
--- a/Hoftor_Dokumentation_v0.39.docx
+++ b/Hoftor_Dokumentation_v0.39.docx
@@ -1245,13 +1245,39 @@
           <w:b/>
           <w:bCs/>
         </w:rPr>
-        <w:t xml:space="preserve">Server-Sync:</w:t>
-      </w:r>
-      <w:r>
-        <w:t xml:space="preserve"> </w:t>
-      </w:r>
-      <w:r>
-        <w:t xml:space="preserve">ESPHome baut aus</w:t>
+        <w:t xml:space="preserve">Kein Server-Sync:</w:t>
+      </w:r>
+      <w:r>
+        <w:t xml:space="preserve"> </w:t>
+      </w:r>
+      <w:r>
+        <w:t xml:space="preserve">Das Hoftor gehört zur</w:t>
+      </w:r>
+      <w:r>
+        <w:t xml:space="preserve"> </w:t>
+      </w:r>
+      <w:r>
+        <w:rPr>
+          <w:b/>
+          <w:bCs/>
+        </w:rPr>
+        <w:t xml:space="preserve">Keller-HA</w:t>
+      </w:r>
+      <w:r>
+        <w:t xml:space="preserve"> </w:t>
+      </w:r>
+      <w:r>
+        <w:t xml:space="preserve">(nicht DG). Die YAML lebt</w:t>
+      </w:r>
+      <w:r>
+        <w:t xml:space="preserve"> </w:t>
+      </w:r>
+      <w:r>
+        <w:rPr>
+          <w:b/>
+          <w:bCs/>
+        </w:rPr>
+        <w:t xml:space="preserve">nur im Repo</w:t>
       </w:r>
       <w:r>
         <w:t xml:space="preserve"> </w:t>
@@ -1260,10 +1286,10 @@
         <w:rPr>
           <w:rStyle w:val="VerbatimChar"/>
         </w:rPr>
-        <w:t xml:space="preserve">\\192.168.210.11\config\esphome\hoftor.yaml</w:t>
-      </w:r>
-      <w:r>
-        <w:t xml:space="preserve">,</w:t>
+        <w:t xml:space="preserve">S:\Projekte\hw-hoftor\</w:t>
+      </w:r>
+      <w:r>
+        <w:t xml:space="preserve">;</w:t>
       </w:r>
       <w:r>
         <w:t xml:space="preserve"> </w:t>
@@ -1279,23 +1305,22 @@
         <w:t xml:space="preserve"> </w:t>
       </w:r>
       <w:r>
-        <w:t xml:space="preserve">aus dem Repo. Bei YAML-Änderung: Repo editieren</w:t>
-      </w:r>
-      <w:r>
-        <w:t xml:space="preserve"> </w:t>
-      </w:r>
-      <w:r>
-        <w:rPr>
-          <w:b/>
-          <w:bCs/>
-        </w:rPr>
-        <w:t xml:space="preserve">+</w:t>
-      </w:r>
-      <w:r>
-        <w:t xml:space="preserve"> </w:t>
-      </w:r>
-      <w:r>
-        <w:t xml:space="preserve">auf Server kopieren + SHA256 gegenprüfen.</w:t>
+        <w:t xml:space="preserve">auf den DG-Share</w:t>
+      </w:r>
+      <w:r>
+        <w:t xml:space="preserve"> </w:t>
+      </w:r>
+      <w:r>
+        <w:rPr>
+          <w:rStyle w:val="VerbatimChar"/>
+        </w:rPr>
+        <w:t xml:space="preserve">\\192.168.210.11\config\esphome\</w:t>
+      </w:r>
+      <w:r>
+        <w:t xml:space="preserve"> </w:t>
+      </w:r>
+      <w:r>
+        <w:t xml:space="preserve">laden. Geflasht wird manuell / von der Keller-Instanz.</w:t>
       </w:r>
     </w:p>
     <w:p>

</xml_diff>